<commit_message>
Rewrite the IA in the student's requested structure and voice
Restructure into the eight requested sections, add both Model 1 residual
tables to the main text, the summary and error tables, style-only figure
captions and an accurate tools declaration. Tighten the layout (Calibri,
2 cm margins) so the body fits about 18 pages; all 72 worked-calculation
checks still pass.

Co-Authored-By: Claude Opus 5.5 <noreply@anthropic.com>
Claude-Session: https://claude.ai/code/session_015SCYj96TGcZgc8vCSX2dH8
</commit_message>
<xml_diff>
--- a/math-ia-gini/draft/reference.docx
+++ b/math-ia-gini/draft/reference.docx
@@ -318,7 +318,7 @@
         <w:numRestart w:val="eachSect"/>
       </w:footnotePr>
       <w:pgSz w:w="11906" w:h="16838"/>
-      <w:pgMar w:top="1418" w:right="1418" w:bottom="1418" w:left="1418" w:header="709" w:footer="709" w:gutter="0"/>
+      <w:pgMar w:top="1134" w:right="1134" w:bottom="1134" w:left="1134" w:header="567" w:footer="567" w:gutter="0"/>
     </w:sectPr>
   </w:body>
 </w:document>
@@ -510,7 +510,7 @@
     <w:link w:val="BodyTextChar"/>
     <w:qFormat/>
     <w:pPr>
-      <w:spacing w:before="60" w:after="120" w:line="264" w:lineRule="auto"/>
+      <w:spacing w:before="40" w:after="100" w:line="245" w:lineRule="auto"/>
     </w:pPr>
   </w:style>
   <w:style w:type="paragraph" w:customStyle="1" w:styleId="FirstParagraph">
@@ -1188,7 +1188,7 @@
     </a:clrScheme>
     <a:fontScheme name="Office">
       <a:majorFont>
-        <a:latin typeface="Aptos Display" panose="02110004020202020204"/>
+        <a:latin typeface="Calibri Light" panose="02110004020202020204"/>
         <a:ea typeface=""/>
         <a:cs typeface=""/>
         <a:font script="Jpan" typeface="游ゴシック Light"/>
@@ -1240,7 +1240,7 @@
         <a:font script="Tfng" typeface="Ebrima"/>
       </a:majorFont>
       <a:minorFont>
-        <a:latin typeface="Aptos" panose="02110004020202020204"/>
+        <a:latin typeface="Calibri" panose="02110004020202020204"/>
         <a:ea typeface=""/>
         <a:cs typeface=""/>
         <a:font script="Jpan" typeface="游明朝"/>

</xml_diff>

<commit_message>
Simplify the IA and add a written-text-only version
Remove blue from headings, links and figures (black and grey only, told
apart by line style), cut the figures from six to three and trim the
heavier derivations. The build now writes two documents: the complete IA
and a version with only the written text (no formulas, tables or figures).

Co-Authored-By: Claude Opus 5.5 <noreply@anthropic.com>
Claude-Session: https://claude.ai/code/session_015SCYj96TGcZgc8vCSX2dH8
</commit_message>
<xml_diff>
--- a/math-ia-gini/draft/reference.docx
+++ b/math-ia-gini/draft/reference.docx
@@ -590,7 +590,7 @@
     <w:rsid w:val="00A10FD9"/>
     <w:rPr>
       <w:rFonts w:eastAsiaTheme="majorEastAsia" w:cstheme="majorBidi"/>
-      <w:color w:val="595959" w:themeColor="text1" w:themeTint="A6"/>
+      <w:color w:val="000000"/>
       <w:spacing w:val="15"/>
       <w:sz w:val="28"/>
       <w:szCs w:val="28"/>
@@ -680,7 +680,7 @@
     </w:pPr>
     <w:rPr>
       <w:rFonts w:asciiTheme="majorHAnsi" w:eastAsiaTheme="majorEastAsia" w:hAnsiTheme="majorHAnsi" w:cstheme="majorBidi"/>
-      <w:color w:val="0F4761" w:themeColor="accent1" w:themeShade="BF"/>
+      <w:color w:val="000000"/>
       <w:sz w:val="40"/>
       <w:szCs w:val="40"/>
     </w:rPr>
@@ -703,7 +703,7 @@
     </w:pPr>
     <w:rPr>
       <w:rFonts w:asciiTheme="majorHAnsi" w:eastAsiaTheme="majorEastAsia" w:hAnsiTheme="majorHAnsi" w:cstheme="majorBidi"/>
-      <w:color w:val="0F4761" w:themeColor="accent1" w:themeShade="BF"/>
+      <w:color w:val="000000"/>
       <w:sz w:val="32"/>
       <w:szCs w:val="32"/>
     </w:rPr>
@@ -726,7 +726,7 @@
     </w:pPr>
     <w:rPr>
       <w:rFonts w:eastAsiaTheme="majorEastAsia" w:cstheme="majorBidi"/>
-      <w:color w:val="0F4761" w:themeColor="accent1" w:themeShade="BF"/>
+      <w:color w:val="000000"/>
       <w:sz w:val="28"/>
       <w:szCs w:val="28"/>
     </w:rPr>
@@ -751,7 +751,7 @@
       <w:rFonts w:eastAsiaTheme="majorEastAsia" w:cstheme="majorBidi"/>
       <w:i/>
       <w:iCs/>
-      <w:color w:val="0F4761" w:themeColor="accent1" w:themeShade="BF"/>
+      <w:color w:val="000000"/>
     </w:rPr>
   </w:style>
   <w:style w:type="paragraph" w:styleId="Heading5">
@@ -772,7 +772,7 @@
     </w:pPr>
     <w:rPr>
       <w:rFonts w:eastAsiaTheme="majorEastAsia" w:cstheme="majorBidi"/>
-      <w:color w:val="0F4761" w:themeColor="accent1" w:themeShade="BF"/>
+      <w:color w:val="000000"/>
     </w:rPr>
   </w:style>
   <w:style w:type="paragraph" w:styleId="Heading6">
@@ -795,7 +795,7 @@
       <w:rFonts w:eastAsiaTheme="majorEastAsia" w:cstheme="majorBidi"/>
       <w:i/>
       <w:iCs/>
-      <w:color w:val="595959" w:themeColor="text1" w:themeTint="A6"/>
+      <w:color w:val="000000"/>
     </w:rPr>
   </w:style>
   <w:style w:type="paragraph" w:styleId="Heading7">
@@ -816,7 +816,7 @@
     </w:pPr>
     <w:rPr>
       <w:rFonts w:eastAsiaTheme="majorEastAsia" w:cstheme="majorBidi"/>
-      <w:color w:val="595959" w:themeColor="text1" w:themeTint="A6"/>
+      <w:color w:val="000000"/>
     </w:rPr>
   </w:style>
   <w:style w:type="paragraph" w:styleId="Heading8">
@@ -839,7 +839,7 @@
       <w:rFonts w:eastAsiaTheme="majorEastAsia" w:cstheme="majorBidi"/>
       <w:i/>
       <w:iCs/>
-      <w:color w:val="272727" w:themeColor="text1" w:themeTint="D8"/>
+      <w:color w:val="000000"/>
     </w:rPr>
   </w:style>
   <w:style w:type="paragraph" w:styleId="Heading9">
@@ -860,7 +860,7 @@
     </w:pPr>
     <w:rPr>
       <w:rFonts w:eastAsiaTheme="majorEastAsia" w:cstheme="majorBidi"/>
-      <w:color w:val="272727" w:themeColor="text1" w:themeTint="D8"/>
+      <w:color w:val="000000"/>
     </w:rPr>
   </w:style>
   <w:style w:type="character" w:customStyle="1" w:styleId="Heading1Char">
@@ -871,7 +871,7 @@
     <w:rsid w:val="00A10FD9"/>
     <w:rPr>
       <w:rFonts w:asciiTheme="majorHAnsi" w:eastAsiaTheme="majorEastAsia" w:hAnsiTheme="majorHAnsi" w:cstheme="majorBidi"/>
-      <w:color w:val="0F4761" w:themeColor="accent1" w:themeShade="BF"/>
+      <w:color w:val="000000"/>
       <w:sz w:val="40"/>
       <w:szCs w:val="40"/>
     </w:rPr>
@@ -885,7 +885,7 @@
     <w:rsid w:val="00A10FD9"/>
     <w:rPr>
       <w:rFonts w:asciiTheme="majorHAnsi" w:eastAsiaTheme="majorEastAsia" w:hAnsiTheme="majorHAnsi" w:cstheme="majorBidi"/>
-      <w:color w:val="0F4761" w:themeColor="accent1" w:themeShade="BF"/>
+      <w:color w:val="000000"/>
       <w:sz w:val="32"/>
       <w:szCs w:val="32"/>
     </w:rPr>
@@ -899,7 +899,7 @@
     <w:rsid w:val="00A10FD9"/>
     <w:rPr>
       <w:rFonts w:eastAsiaTheme="majorEastAsia" w:cstheme="majorBidi"/>
-      <w:color w:val="0F4761" w:themeColor="accent1" w:themeShade="BF"/>
+      <w:color w:val="000000"/>
       <w:sz w:val="28"/>
       <w:szCs w:val="28"/>
     </w:rPr>
@@ -915,7 +915,7 @@
       <w:rFonts w:eastAsiaTheme="majorEastAsia" w:cstheme="majorBidi"/>
       <w:i/>
       <w:iCs/>
-      <w:color w:val="0F4761" w:themeColor="accent1" w:themeShade="BF"/>
+      <w:color w:val="000000"/>
     </w:rPr>
   </w:style>
   <w:style w:type="character" w:customStyle="1" w:styleId="Heading5Char">
@@ -927,7 +927,7 @@
     <w:rsid w:val="00A10FD9"/>
     <w:rPr>
       <w:rFonts w:eastAsiaTheme="majorEastAsia" w:cstheme="majorBidi"/>
-      <w:color w:val="0F4761" w:themeColor="accent1" w:themeShade="BF"/>
+      <w:color w:val="000000"/>
     </w:rPr>
   </w:style>
   <w:style w:type="character" w:customStyle="1" w:styleId="Heading6Char">
@@ -941,7 +941,7 @@
       <w:rFonts w:eastAsiaTheme="majorEastAsia" w:cstheme="majorBidi"/>
       <w:i/>
       <w:iCs/>
-      <w:color w:val="595959" w:themeColor="text1" w:themeTint="A6"/>
+      <w:color w:val="000000"/>
     </w:rPr>
   </w:style>
   <w:style w:type="character" w:customStyle="1" w:styleId="Heading7Char">
@@ -953,7 +953,7 @@
     <w:rsid w:val="00A10FD9"/>
     <w:rPr>
       <w:rFonts w:eastAsiaTheme="majorEastAsia" w:cstheme="majorBidi"/>
-      <w:color w:val="595959" w:themeColor="text1" w:themeTint="A6"/>
+      <w:color w:val="000000"/>
     </w:rPr>
   </w:style>
   <w:style w:type="character" w:customStyle="1" w:styleId="Heading8Char">
@@ -967,7 +967,7 @@
       <w:rFonts w:eastAsiaTheme="majorEastAsia" w:cstheme="majorBidi"/>
       <w:i/>
       <w:iCs/>
-      <w:color w:val="272727" w:themeColor="text1" w:themeTint="D8"/>
+      <w:color w:val="000000"/>
     </w:rPr>
   </w:style>
   <w:style w:type="character" w:customStyle="1" w:styleId="Heading9Char">
@@ -979,7 +979,7 @@
     <w:rsid w:val="00A10FD9"/>
     <w:rPr>
       <w:rFonts w:eastAsiaTheme="majorEastAsia" w:cstheme="majorBidi"/>
-      <w:color w:val="272727" w:themeColor="text1" w:themeTint="D8"/>
+      <w:color w:val="000000"/>
     </w:rPr>
   </w:style>
   <w:style w:type="paragraph" w:styleId="BlockText">
@@ -1121,7 +1121,7 @@
     <w:name w:val="Hyperlink"/>
     <w:basedOn w:val="BodyTextChar"/>
     <w:rPr>
-      <w:color w:val="4F81BD" w:themeColor="accent1"/>
+      <w:color w:val="000000"/>
     </w:rPr>
   </w:style>
   <w:style w:type="paragraph" w:styleId="TOCHeading">
@@ -1139,7 +1139,7 @@
       <w:rFonts w:asciiTheme="majorHAnsi" w:eastAsiaTheme="majorEastAsia" w:hAnsiTheme="majorHAnsi" w:cstheme="majorBidi"/>
       <w:b w:val="0"/>
       <w:bCs w:val="0"/>
-      <w:color w:val="365F91" w:themeColor="accent1" w:themeShade="BF"/>
+      <w:color w:val="000000"/>
     </w:rPr>
   </w:style>
 </w:styles>

</xml_diff>